<commit_message>
Added Screenshot to MAS-MiniProject + added name to PW reports
</commit_message>
<xml_diff>
--- a/rapports/TP4_Report.docx
+++ b/rapports/TP4_Report.docx
@@ -70,6 +70,12 @@
       <w:pPr>
         <w:spacing w:before="120" w:after="120"/>
         <w:jc w:val="center"/>
+        <w:rPr>
+          <w:b/>
+          <w:bCs/>
+          <w:sz w:val="32"/>
+          <w:szCs w:val="32"/>
+        </w:rPr>
       </w:pPr>
       <w:r>
         <w:rPr>
@@ -80,6 +86,58 @@
         </w:rPr>
         <w:t>Agent Behaviours in JADE</w:t>
       </w:r>
+    </w:p>
+    <w:p>
+      <w:pPr>
+        <w:spacing w:before="120" w:after="120"/>
+        <w:jc w:val="center"/>
+        <w:rPr>
+          <w:b/>
+          <w:bCs/>
+          <w:sz w:val="32"/>
+          <w:szCs w:val="32"/>
+        </w:rPr>
+      </w:pPr>
+    </w:p>
+    <w:p>
+      <w:pPr>
+        <w:spacing w:before="120" w:after="120"/>
+        <w:jc w:val="center"/>
+        <w:rPr>
+          <w:b/>
+          <w:bCs/>
+          <w:sz w:val="32"/>
+          <w:szCs w:val="32"/>
+        </w:rPr>
+      </w:pPr>
+    </w:p>
+    <w:p>
+      <w:pPr>
+        <w:spacing w:before="120" w:after="120"/>
+        <w:jc w:val="center"/>
+      </w:pPr>
+      <w:r>
+        <w:rPr>
+          <w:b/>
+          <w:bCs/>
+        </w:rPr>
+        <w:t>Realized by:</w:t>
+      </w:r>
+    </w:p>
+    <w:p>
+      <w:pPr>
+        <w:spacing w:before="120" w:after="120"/>
+        <w:jc w:val="center"/>
+      </w:pPr>
+      <w:r>
+        <w:t>CHAABNI Amanda Manel</w:t>
+      </w:r>
+    </w:p>
+    <w:p>
+      <w:pPr>
+        <w:spacing w:before="120" w:after="120"/>
+        <w:jc w:val="center"/>
+      </w:pPr>
     </w:p>
     <w:p/>
     <w:p/>
@@ -249,12 +307,6 @@
         <w:gridCol w:w="4513"/>
       </w:tblGrid>
       <w:tr>
-        <w:tblPrEx>
-          <w:tblCellMar>
-            <w:top w:w="0" w:type="dxa"/>
-            <w:bottom w:w="0" w:type="dxa"/>
-          </w:tblCellMar>
-        </w:tblPrEx>
         <w:tc>
           <w:tcPr>
             <w:tcW w:w="4513" w:type="dxa"/>
@@ -312,12 +364,6 @@
         </w:tc>
       </w:tr>
       <w:tr>
-        <w:tblPrEx>
-          <w:tblCellMar>
-            <w:top w:w="0" w:type="dxa"/>
-            <w:bottom w:w="0" w:type="dxa"/>
-          </w:tblCellMar>
-        </w:tblPrEx>
         <w:tc>
           <w:tcPr>
             <w:tcW w:w="4513" w:type="dxa"/>
@@ -364,12 +410,6 @@
         </w:tc>
       </w:tr>
       <w:tr>
-        <w:tblPrEx>
-          <w:tblCellMar>
-            <w:top w:w="0" w:type="dxa"/>
-            <w:bottom w:w="0" w:type="dxa"/>
-          </w:tblCellMar>
-        </w:tblPrEx>
         <w:tc>
           <w:tcPr>
             <w:tcW w:w="4513" w:type="dxa"/>
@@ -416,12 +456,6 @@
         </w:tc>
       </w:tr>
       <w:tr>
-        <w:tblPrEx>
-          <w:tblCellMar>
-            <w:top w:w="0" w:type="dxa"/>
-            <w:bottom w:w="0" w:type="dxa"/>
-          </w:tblCellMar>
-        </w:tblPrEx>
         <w:tc>
           <w:tcPr>
             <w:tcW w:w="4513" w:type="dxa"/>
@@ -468,12 +502,6 @@
         </w:tc>
       </w:tr>
       <w:tr>
-        <w:tblPrEx>
-          <w:tblCellMar>
-            <w:top w:w="0" w:type="dxa"/>
-            <w:bottom w:w="0" w:type="dxa"/>
-          </w:tblCellMar>
-        </w:tblPrEx>
         <w:tc>
           <w:tcPr>
             <w:tcW w:w="4513" w:type="dxa"/>
@@ -520,12 +548,6 @@
         </w:tc>
       </w:tr>
       <w:tr>
-        <w:tblPrEx>
-          <w:tblCellMar>
-            <w:top w:w="0" w:type="dxa"/>
-            <w:bottom w:w="0" w:type="dxa"/>
-          </w:tblCellMar>
-        </w:tblPrEx>
         <w:tc>
           <w:tcPr>
             <w:tcW w:w="4513" w:type="dxa"/>
@@ -572,12 +594,6 @@
         </w:tc>
       </w:tr>
       <w:tr>
-        <w:tblPrEx>
-          <w:tblCellMar>
-            <w:top w:w="0" w:type="dxa"/>
-            <w:bottom w:w="0" w:type="dxa"/>
-          </w:tblCellMar>
-        </w:tblPrEx>
         <w:tc>
           <w:tcPr>
             <w:tcW w:w="4513" w:type="dxa"/>
@@ -624,12 +640,6 @@
         </w:tc>
       </w:tr>
       <w:tr>
-        <w:tblPrEx>
-          <w:tblCellMar>
-            <w:top w:w="0" w:type="dxa"/>
-            <w:bottom w:w="0" w:type="dxa"/>
-          </w:tblCellMar>
-        </w:tblPrEx>
         <w:tc>
           <w:tcPr>
             <w:tcW w:w="4513" w:type="dxa"/>
@@ -676,12 +686,6 @@
         </w:tc>
       </w:tr>
       <w:tr>
-        <w:tblPrEx>
-          <w:tblCellMar>
-            <w:top w:w="0" w:type="dxa"/>
-            <w:bottom w:w="0" w:type="dxa"/>
-          </w:tblCellMar>
-        </w:tblPrEx>
         <w:tc>
           <w:tcPr>
             <w:tcW w:w="4513" w:type="dxa"/>
@@ -891,12 +895,6 @@
         <w:gridCol w:w="9026"/>
       </w:tblGrid>
       <w:tr>
-        <w:tblPrEx>
-          <w:tblCellMar>
-            <w:top w:w="0" w:type="dxa"/>
-            <w:bottom w:w="0" w:type="dxa"/>
-          </w:tblCellMar>
-        </w:tblPrEx>
         <w:tc>
           <w:tcPr>
             <w:tcW w:w="9026" w:type="dxa"/>
@@ -1395,7 +1393,7 @@
           <w:noProof/>
         </w:rPr>
         <w:drawing>
-          <wp:anchor distT="0" distB="0" distL="114300" distR="114300" simplePos="0" relativeHeight="251658240" behindDoc="0" locked="0" layoutInCell="1" allowOverlap="1" wp14:anchorId="602159D0" wp14:editId="2E2EF72B">
+          <wp:anchor distT="0" distB="0" distL="114300" distR="114300" simplePos="0" relativeHeight="251658240" behindDoc="0" locked="0" layoutInCell="1" allowOverlap="1" wp14:anchorId="602159D0" wp14:editId="4A2F5CC5">
             <wp:simplePos x="0" y="0"/>
             <wp:positionH relativeFrom="column">
               <wp:posOffset>2543175</wp:posOffset>
@@ -1787,25 +1785,7 @@
         <w:rPr>
           <w:u w:val="single"/>
         </w:rPr>
-        <w:t>Creat</w:t>
-      </w:r>
-      <w:r>
-        <w:rPr>
-          <w:u w:val="single"/>
-        </w:rPr>
-        <w:t>ing</w:t>
-      </w:r>
-      <w:r>
-        <w:rPr>
-          <w:u w:val="single"/>
-        </w:rPr>
-        <w:t xml:space="preserve"> the agent inside container_2 via GUI</w:t>
-      </w:r>
-      <w:r>
-        <w:rPr>
-          <w:u w:val="single"/>
-        </w:rPr>
-        <w:t>:</w:t>
+        <w:t>Creating the agent inside container_2 via GUI:</w:t>
       </w:r>
     </w:p>
     <w:p>
@@ -1877,7 +1857,7 @@
           <w:noProof/>
         </w:rPr>
         <w:drawing>
-          <wp:anchor distT="0" distB="0" distL="114300" distR="114300" simplePos="0" relativeHeight="251665408" behindDoc="0" locked="0" layoutInCell="1" allowOverlap="1" wp14:anchorId="598338ED" wp14:editId="0E48291B">
+          <wp:anchor distT="0" distB="0" distL="114300" distR="114300" simplePos="0" relativeHeight="251665408" behindDoc="0" locked="0" layoutInCell="1" allowOverlap="1" wp14:anchorId="598338ED" wp14:editId="1BA5FEDE">
             <wp:simplePos x="0" y="0"/>
             <wp:positionH relativeFrom="column">
               <wp:posOffset>-235527</wp:posOffset>
@@ -2021,12 +2001,6 @@
         <w:gridCol w:w="9026"/>
       </w:tblGrid>
       <w:tr>
-        <w:tblPrEx>
-          <w:tblCellMar>
-            <w:top w:w="0" w:type="dxa"/>
-            <w:bottom w:w="0" w:type="dxa"/>
-          </w:tblCellMar>
-        </w:tblPrEx>
         <w:tc>
           <w:tcPr>
             <w:tcW w:w="9026" w:type="dxa"/>
@@ -2431,12 +2405,6 @@
         <w:gridCol w:w="3009"/>
       </w:tblGrid>
       <w:tr>
-        <w:tblPrEx>
-          <w:tblCellMar>
-            <w:top w:w="0" w:type="dxa"/>
-            <w:bottom w:w="0" w:type="dxa"/>
-          </w:tblCellMar>
-        </w:tblPrEx>
         <w:tc>
           <w:tcPr>
             <w:tcW w:w="3008" w:type="dxa"/>
@@ -2520,12 +2488,6 @@
         </w:tc>
       </w:tr>
       <w:tr>
-        <w:tblPrEx>
-          <w:tblCellMar>
-            <w:top w:w="0" w:type="dxa"/>
-            <w:bottom w:w="0" w:type="dxa"/>
-          </w:tblCellMar>
-        </w:tblPrEx>
         <w:tc>
           <w:tcPr>
             <w:tcW w:w="3008" w:type="dxa"/>
@@ -2594,12 +2556,6 @@
         </w:tc>
       </w:tr>
       <w:tr>
-        <w:tblPrEx>
-          <w:tblCellMar>
-            <w:top w:w="0" w:type="dxa"/>
-            <w:bottom w:w="0" w:type="dxa"/>
-          </w:tblCellMar>
-        </w:tblPrEx>
         <w:tc>
           <w:tcPr>
             <w:tcW w:w="3008" w:type="dxa"/>
@@ -2668,12 +2624,6 @@
         </w:tc>
       </w:tr>
       <w:tr>
-        <w:tblPrEx>
-          <w:tblCellMar>
-            <w:top w:w="0" w:type="dxa"/>
-            <w:bottom w:w="0" w:type="dxa"/>
-          </w:tblCellMar>
-        </w:tblPrEx>
         <w:tc>
           <w:tcPr>
             <w:tcW w:w="3008" w:type="dxa"/>
@@ -2742,12 +2692,6 @@
         </w:tc>
       </w:tr>
       <w:tr>
-        <w:tblPrEx>
-          <w:tblCellMar>
-            <w:top w:w="0" w:type="dxa"/>
-            <w:bottom w:w="0" w:type="dxa"/>
-          </w:tblCellMar>
-        </w:tblPrEx>
         <w:tc>
           <w:tcPr>
             <w:tcW w:w="3008" w:type="dxa"/>
@@ -2816,12 +2760,6 @@
         </w:tc>
       </w:tr>
       <w:tr>
-        <w:tblPrEx>
-          <w:tblCellMar>
-            <w:top w:w="0" w:type="dxa"/>
-            <w:bottom w:w="0" w:type="dxa"/>
-          </w:tblCellMar>
-        </w:tblPrEx>
         <w:tc>
           <w:tcPr>
             <w:tcW w:w="3008" w:type="dxa"/>
@@ -2920,12 +2858,6 @@
         <w:gridCol w:w="9026"/>
       </w:tblGrid>
       <w:tr>
-        <w:tblPrEx>
-          <w:tblCellMar>
-            <w:top w:w="0" w:type="dxa"/>
-            <w:bottom w:w="0" w:type="dxa"/>
-          </w:tblCellMar>
-        </w:tblPrEx>
         <w:tc>
           <w:tcPr>
             <w:tcW w:w="9026" w:type="dxa"/>
@@ -3549,12 +3481,6 @@
         <w:gridCol w:w="9026"/>
       </w:tblGrid>
       <w:tr>
-        <w:tblPrEx>
-          <w:tblCellMar>
-            <w:top w:w="0" w:type="dxa"/>
-            <w:bottom w:w="0" w:type="dxa"/>
-          </w:tblCellMar>
-        </w:tblPrEx>
         <w:tc>
           <w:tcPr>
             <w:tcW w:w="9026" w:type="dxa"/>
@@ -3752,6 +3678,9 @@
         <w:pStyle w:val="ListParagraph"/>
       </w:pPr>
       <w:r>
+        <w:rPr>
+          <w:noProof/>
+        </w:rPr>
         <w:drawing>
           <wp:inline distT="0" distB="0" distL="0" distR="0" wp14:anchorId="49F16AE5" wp14:editId="34DCF2DC">
             <wp:extent cx="5731510" cy="1620520"/>
@@ -3948,12 +3877,6 @@
         <w:gridCol w:w="9680"/>
       </w:tblGrid>
       <w:tr>
-        <w:tblPrEx>
-          <w:tblCellMar>
-            <w:top w:w="0" w:type="dxa"/>
-            <w:bottom w:w="0" w:type="dxa"/>
-          </w:tblCellMar>
-        </w:tblPrEx>
         <w:tc>
           <w:tcPr>
             <w:tcW w:w="9026" w:type="dxa"/>
@@ -4483,12 +4406,6 @@
         <w:gridCol w:w="9026"/>
       </w:tblGrid>
       <w:tr>
-        <w:tblPrEx>
-          <w:tblCellMar>
-            <w:top w:w="0" w:type="dxa"/>
-            <w:bottom w:w="0" w:type="dxa"/>
-          </w:tblCellMar>
-        </w:tblPrEx>
         <w:tc>
           <w:tcPr>
             <w:tcW w:w="9026" w:type="dxa"/>
@@ -4591,12 +4508,6 @@
         <w:gridCol w:w="9026"/>
       </w:tblGrid>
       <w:tr>
-        <w:tblPrEx>
-          <w:tblCellMar>
-            <w:top w:w="0" w:type="dxa"/>
-            <w:bottom w:w="0" w:type="dxa"/>
-          </w:tblCellMar>
-        </w:tblPrEx>
         <w:tc>
           <w:tcPr>
             <w:tcW w:w="9026" w:type="dxa"/>

</xml_diff>